<commit_message>
chore(docs): v2.4 quick-win housekeeping
- Rename in-repo baseline mirror acrme_requirements_baseline_v2_2.{md,docx,pdf}
  -> _v2_4.* to match its internal version (v2.4).
- Bump docs/README.md single-source-of-truth reference v2.2 -> v2.4.
- Add a v2.4 status note to docs/adr/README.md: ADR-002 reconciled;
  ADR-001/003/004/005 still v2.2/v2.3 and pending design-phase
  reconciliation (legacy three-region gate superseded by the v2.4
  geography-aware model). Historical v2.2 reconciliation record retained.
- Fix all inbound baseline-filename links (docs/README.md, README.md,
  README_PHASE3.md, capacity_and_quota_management_requirements_v2.md,
  acrme_design_change_and_fdd_tdd_plan.md) to the new v2_4 filename.
</commit_message>
<xml_diff>
--- a/docs/requirements/capacity_and_quota_management_requirements_v2.docx
+++ b/docs/requirements/capacity_and_quota_management_requirements_v2.docx
@@ -15,9 +15,9 @@
       <w:pPr>
         <w:pStyle w:val="Heading2"/>
       </w:pPr>
-      <w:bookmarkStart w:id="20" w:name="superseded-7-sep-2026-see-baseline-v2.3"/>
-      <w:r>
-        <w:t xml:space="preserve">⚠️ SUPERSEDED (7 Sep 2026) — see Baseline v2.3</w:t>
+      <w:bookmarkStart w:id="20" w:name="superseded-7-sep-2026-see-baseline-v2.4"/>
+      <w:r>
+        <w:t xml:space="preserve">⚠️ SUPERSEDED (7 Sep 2026) — see Baseline v2.4</w:t>
       </w:r>
       <w:bookmarkEnd w:id="20"/>
     </w:p>
@@ -69,21 +69,21 @@
           <w:bCs/>
           <w:b/>
         </w:rPr>
-        <w:t xml:space="preserve">acrme_requirements_baseline_v2_2.md</w:t>
-      </w:r>
-      <w:r>
-        <w:rPr>
-          <w:bCs/>
-          <w:b/>
-        </w:rPr>
-        <w:t xml:space="preserve"> </w:t>
-      </w:r>
-      <w:r>
-        <w:rPr>
-          <w:bCs/>
-          <w:b/>
-        </w:rPr>
-        <w:t xml:space="preserve">(internal version v2.3)</w:t>
+        <w:t xml:space="preserve">acrme_requirements_baseline_v2_4.md</w:t>
+      </w:r>
+      <w:r>
+        <w:rPr>
+          <w:bCs/>
+          <w:b/>
+        </w:rPr>
+        <w:t xml:space="preserve"> </w:t>
+      </w:r>
+      <w:r>
+        <w:rPr>
+          <w:bCs/>
+          <w:b/>
+        </w:rPr>
+        <w:t xml:space="preserve">(version v2.4)</w:t>
       </w:r>
       <w:r>
         <w:t xml:space="preserve">, which is the</w:t>
@@ -112,7 +112,7 @@
         <w:t xml:space="preserve">region scope below is outdated</w:t>
       </w:r>
       <w:r>
-        <w:t xml:space="preserve">: v2.3 supports</w:t>
+        <w:t xml:space="preserve">: v2.4 supports</w:t>
       </w:r>
       <w:r>
         <w:t xml:space="preserve"> </w:t>

</xml_diff>